<commit_message>
Actualizacion de codigo y limpieza de credenciales
</commit_message>
<xml_diff>
--- a/Planeador/plantilla2026/PLANEADOR2026.docx
+++ b/Planeador/plantilla2026/PLANEADOR2026.docx
@@ -9,12 +9,12 @@
         <w:tblLook w:val="04A0" w:firstRow="1" w:lastRow="0" w:firstColumn="1" w:lastColumn="0" w:noHBand="0" w:noVBand="1"/>
       </w:tblPr>
       <w:tblGrid>
-        <w:gridCol w:w="964"/>
-        <w:gridCol w:w="1550"/>
-        <w:gridCol w:w="884"/>
-        <w:gridCol w:w="3545"/>
-        <w:gridCol w:w="685"/>
-        <w:gridCol w:w="1433"/>
+        <w:gridCol w:w="1113"/>
+        <w:gridCol w:w="1578"/>
+        <w:gridCol w:w="889"/>
+        <w:gridCol w:w="3647"/>
+        <w:gridCol w:w="682"/>
+        <w:gridCol w:w="1486"/>
       </w:tblGrid>
       <w:tr>
         <w:trPr>
@@ -69,7 +69,7 @@
                 <w:color w:val="000000" w:themeColor="text1"/>
                 <w:szCs w:val="24"/>
               </w:rPr>
-              <w:t xml:space="preserve">Enero </w:t>
+              <w:t>{mes}</w:t>
             </w:r>
           </w:p>
         </w:tc>
@@ -82,7 +82,7 @@
               <w:spacing w:line="276" w:lineRule="auto"/>
               <w:rPr>
                 <w:rFonts w:ascii="Times New Roman" w:hAnsi="Times New Roman"/>
-                <w:bCs/>
+                <w:b/>
                 <w:color w:val="000000" w:themeColor="text1"/>
                 <w:szCs w:val="24"/>
               </w:rPr>
@@ -108,11 +108,47 @@
             <w:r>
               <w:rPr>
                 <w:rFonts w:ascii="Times New Roman" w:hAnsi="Times New Roman"/>
-                <w:bCs/>
+                <w:b/>
                 <w:color w:val="000000" w:themeColor="text1"/>
                 <w:szCs w:val="24"/>
               </w:rPr>
-              <w:t>Enero 19 a Enero 30</w:t>
+              <w:t>{fecha</w:t>
+            </w:r>
+            <w:r>
+              <w:rPr>
+                <w:rFonts w:ascii="Times New Roman" w:hAnsi="Times New Roman"/>
+                <w:b/>
+                <w:color w:val="000000" w:themeColor="text1"/>
+                <w:szCs w:val="24"/>
+              </w:rPr>
+              <w:t>_inici</w:t>
+            </w:r>
+            <w:r>
+              <w:rPr>
+                <w:rFonts w:ascii="Times New Roman" w:hAnsi="Times New Roman"/>
+                <w:b/>
+                <w:color w:val="000000" w:themeColor="text1"/>
+                <w:szCs w:val="24"/>
+              </w:rPr>
+              <w:t>o</w:t>
+            </w:r>
+            <w:r>
+              <w:rPr>
+                <w:rFonts w:ascii="Times New Roman" w:hAnsi="Times New Roman"/>
+                <w:b/>
+                <w:color w:val="000000" w:themeColor="text1"/>
+                <w:szCs w:val="24"/>
+              </w:rPr>
+              <w:t>}</w:t>
+            </w:r>
+            <w:r>
+              <w:rPr>
+                <w:rFonts w:ascii="Times New Roman" w:hAnsi="Times New Roman"/>
+                <w:b/>
+                <w:color w:val="000000" w:themeColor="text1"/>
+                <w:szCs w:val="24"/>
+              </w:rPr>
+              <w:t xml:space="preserve"> a {fecha_fin}</w:t>
             </w:r>
           </w:p>
         </w:tc>
@@ -161,9 +197,11 @@
             <w:r>
               <w:rPr>
                 <w:rFonts w:ascii="Times New Roman" w:hAnsi="Times New Roman"/>
-                <w:szCs w:val="24"/>
-              </w:rPr>
-              <w:t>${periodo}</w:t>
+                <w:bCs/>
+                <w:color w:val="000000" w:themeColor="text1"/>
+                <w:szCs w:val="24"/>
+              </w:rPr>
+              <w:t>{periodo}</w:t>
             </w:r>
           </w:p>
         </w:tc>
@@ -182,7 +220,7 @@
               <w:spacing w:line="276" w:lineRule="auto"/>
               <w:rPr>
                 <w:rFonts w:ascii="Times New Roman" w:hAnsi="Times New Roman"/>
-                <w:b/>
+                <w:bCs/>
                 <w:szCs w:val="24"/>
               </w:rPr>
             </w:pPr>
@@ -202,6 +240,14 @@
               </w:rPr>
               <w:t xml:space="preserve"> </w:t>
             </w:r>
+            <w:r>
+              <w:rPr>
+                <w:rFonts w:ascii="Times New Roman" w:hAnsi="Times New Roman"/>
+                <w:b/>
+                <w:szCs w:val="24"/>
+              </w:rPr>
+              <w:t>{docente}</w:t>
+            </w:r>
           </w:p>
           <w:p>
             <w:pPr>
@@ -212,34 +258,6 @@
                 <w:szCs w:val="24"/>
               </w:rPr>
             </w:pPr>
-            <w:r>
-              <w:rPr>
-                <w:rFonts w:ascii="Times New Roman" w:hAnsi="Times New Roman"/>
-                <w:szCs w:val="24"/>
-              </w:rPr>
-              <w:t>$</w:t>
-            </w:r>
-            <w:r>
-              <w:rPr>
-                <w:rFonts w:ascii="Times New Roman" w:hAnsi="Times New Roman"/>
-                <w:szCs w:val="24"/>
-              </w:rPr>
-              <w:t>[</w:t>
-            </w:r>
-            <w:r>
-              <w:rPr>
-                <w:rFonts w:ascii="Times New Roman" w:hAnsi="Times New Roman"/>
-                <w:szCs w:val="24"/>
-              </w:rPr>
-              <w:t>docente</w:t>
-            </w:r>
-            <w:r>
-              <w:rPr>
-                <w:rFonts w:ascii="Times New Roman" w:hAnsi="Times New Roman"/>
-                <w:szCs w:val="24"/>
-              </w:rPr>
-              <w:t>]</w:t>
-            </w:r>
           </w:p>
         </w:tc>
         <w:tc>
@@ -298,6 +316,14 @@
                 <w:szCs w:val="24"/>
               </w:rPr>
             </w:pPr>
+            <w:r>
+              <w:rPr>
+                <w:rFonts w:ascii="Times New Roman" w:hAnsi="Times New Roman"/>
+                <w:bCs/>
+                <w:szCs w:val="24"/>
+              </w:rPr>
+              <w:t>{materia}</w:t>
+            </w:r>
           </w:p>
         </w:tc>
       </w:tr>
@@ -359,6 +385,14 @@
                 <w:szCs w:val="24"/>
               </w:rPr>
             </w:pPr>
+            <w:r>
+              <w:rPr>
+                <w:rFonts w:ascii="Times New Roman" w:hAnsi="Times New Roman"/>
+                <w:bCs/>
+                <w:szCs w:val="24"/>
+              </w:rPr>
+              <w:t>{dba}</w:t>
+            </w:r>
           </w:p>
           <w:p>
             <w:pPr>
@@ -440,6 +474,14 @@
                 <w:szCs w:val="24"/>
               </w:rPr>
             </w:pPr>
+            <w:r>
+              <w:rPr>
+                <w:rFonts w:ascii="Times New Roman" w:hAnsi="Times New Roman"/>
+                <w:bCs/>
+                <w:szCs w:val="24"/>
+              </w:rPr>
+              <w:t>{objetivos}</w:t>
+            </w:r>
           </w:p>
         </w:tc>
       </w:tr>
@@ -585,16 +627,14 @@
                 <w:szCs w:val="24"/>
               </w:rPr>
             </w:pPr>
-          </w:p>
-          <w:p>
-            <w:pPr>
-              <w:spacing w:line="276" w:lineRule="auto"/>
-              <w:rPr>
-                <w:rFonts w:ascii="Times New Roman" w:hAnsi="Times New Roman"/>
-                <w:bCs/>
-                <w:szCs w:val="24"/>
-              </w:rPr>
-            </w:pPr>
+            <w:r>
+              <w:rPr>
+                <w:rFonts w:ascii="Times New Roman" w:hAnsi="Times New Roman"/>
+                <w:bCs/>
+                <w:szCs w:val="24"/>
+              </w:rPr>
+              <w:t>{tiempo}</w:t>
+            </w:r>
           </w:p>
         </w:tc>
         <w:tc>
@@ -612,6 +652,14 @@
                 <w:szCs w:val="24"/>
               </w:rPr>
             </w:pPr>
+            <w:r>
+              <w:rPr>
+                <w:rFonts w:ascii="Times New Roman" w:hAnsi="Times New Roman"/>
+                <w:bCs/>
+                <w:szCs w:val="24"/>
+              </w:rPr>
+              <w:t>{estrategia}</w:t>
+            </w:r>
           </w:p>
         </w:tc>
         <w:tc>
@@ -628,6 +676,30 @@
                 <w:szCs w:val="24"/>
               </w:rPr>
             </w:pPr>
+            <w:r>
+              <w:rPr>
+                <w:rFonts w:ascii="Times New Roman" w:hAnsi="Times New Roman"/>
+                <w:bCs/>
+                <w:szCs w:val="24"/>
+              </w:rPr>
+              <w:t>{</w:t>
+            </w:r>
+            <w:r>
+              <w:rPr>
+                <w:rFonts w:ascii="Times New Roman" w:hAnsi="Times New Roman"/>
+                <w:bCs/>
+                <w:szCs w:val="24"/>
+              </w:rPr>
+              <w:t>momentos</w:t>
+            </w:r>
+            <w:r>
+              <w:rPr>
+                <w:rFonts w:ascii="Times New Roman" w:hAnsi="Times New Roman"/>
+                <w:bCs/>
+                <w:szCs w:val="24"/>
+              </w:rPr>
+              <w:t>}</w:t>
+            </w:r>
           </w:p>
         </w:tc>
         <w:tc>
@@ -643,6 +715,14 @@
                 <w:szCs w:val="24"/>
               </w:rPr>
             </w:pPr>
+            <w:r>
+              <w:rPr>
+                <w:rFonts w:ascii="Times New Roman" w:hAnsi="Times New Roman"/>
+                <w:bCs/>
+                <w:szCs w:val="24"/>
+              </w:rPr>
+              <w:t>{evaluacion}</w:t>
+            </w:r>
           </w:p>
         </w:tc>
       </w:tr>
@@ -656,8 +736,8 @@
         <w:tblLook w:val="04A0" w:firstRow="1" w:lastRow="0" w:firstColumn="1" w:lastColumn="0" w:noHBand="0" w:noVBand="1"/>
       </w:tblPr>
       <w:tblGrid>
-        <w:gridCol w:w="1042"/>
-        <w:gridCol w:w="8019"/>
+        <w:gridCol w:w="1080"/>
+        <w:gridCol w:w="8315"/>
       </w:tblGrid>
       <w:tr>
         <w:trPr>
@@ -754,9 +834,10 @@
               <w:rPr>
                 <w:rFonts w:ascii="Times New Roman" w:hAnsi="Times New Roman"/>
                 <w:bCs/>
-                <w:szCs w:val="24"/>
-              </w:rPr>
-              <w:t>Enero…</w:t>
+                <w:color w:val="000000" w:themeColor="text1"/>
+                <w:szCs w:val="24"/>
+              </w:rPr>
+              <w:t>{mes}</w:t>
             </w:r>
           </w:p>
         </w:tc>
@@ -860,9 +941,10 @@
               <w:rPr>
                 <w:rFonts w:ascii="Times New Roman" w:hAnsi="Times New Roman"/>
                 <w:bCs/>
-                <w:szCs w:val="24"/>
-              </w:rPr>
-              <w:t>Enero …</w:t>
+                <w:color w:val="000000" w:themeColor="text1"/>
+                <w:szCs w:val="24"/>
+              </w:rPr>
+              <w:t>{mes}</w:t>
             </w:r>
           </w:p>
         </w:tc>
@@ -944,10 +1026,9 @@
         </w:tc>
       </w:tr>
     </w:tbl>
-    <w:p/>
     <w:tbl>
       <w:tblPr>
-        <w:tblpPr w:leftFromText="141" w:rightFromText="141" w:vertAnchor="text" w:horzAnchor="margin" w:tblpX="65" w:tblpY="964"/>
+        <w:tblpPr w:leftFromText="141" w:rightFromText="141" w:vertAnchor="text" w:horzAnchor="margin" w:tblpY="742"/>
         <w:tblOverlap w:val="never"/>
         <w:tblW w:w="5006" w:type="pct"/>
         <w:tblBorders>
@@ -965,8 +1046,8 @@
         <w:tblLook w:val="0000" w:firstRow="0" w:lastRow="0" w:firstColumn="0" w:lastColumn="0" w:noHBand="0" w:noVBand="0"/>
       </w:tblPr>
       <w:tblGrid>
-        <w:gridCol w:w="4746"/>
-        <w:gridCol w:w="4326"/>
+        <w:gridCol w:w="4921"/>
+        <w:gridCol w:w="4485"/>
       </w:tblGrid>
       <w:tr>
         <w:trPr>
@@ -1176,10 +1257,11 @@
       </w:tr>
     </w:tbl>
     <w:p/>
+    <w:p/>
     <w:sectPr>
       <w:headerReference w:type="default" r:id="rId7"/>
       <w:footerReference w:type="default" r:id="rId8"/>
-      <w:pgSz w:w="11906" w:h="16838"/>
+      <w:pgSz w:w="12240" w:h="15840" w:code="1"/>
       <w:pgMar w:top="2552" w:right="1134" w:bottom="1418" w:left="1701" w:header="340" w:footer="0" w:gutter="0"/>
       <w:cols w:space="708"/>
       <w:docGrid w:linePitch="360"/>
@@ -1218,18 +1300,18 @@
         <w:noProof/>
       </w:rPr>
       <w:drawing>
-        <wp:anchor distT="0" distB="0" distL="114300" distR="114300" simplePos="0" relativeHeight="251659264" behindDoc="1" locked="0" layoutInCell="1" allowOverlap="1" wp14:anchorId="49940477" wp14:editId="1FD547ED">
+        <wp:anchor distT="0" distB="0" distL="114300" distR="114300" simplePos="0" relativeHeight="251661312" behindDoc="1" locked="0" layoutInCell="1" allowOverlap="1" wp14:anchorId="2609228C" wp14:editId="39917C43">
           <wp:simplePos x="0" y="0"/>
-          <wp:positionH relativeFrom="margin">
-            <wp:posOffset>-1081333</wp:posOffset>
+          <wp:positionH relativeFrom="page">
+            <wp:align>right</wp:align>
           </wp:positionH>
           <wp:positionV relativeFrom="paragraph">
-            <wp:posOffset>-763270</wp:posOffset>
+            <wp:posOffset>-643447</wp:posOffset>
           </wp:positionV>
-          <wp:extent cx="7546751" cy="955867"/>
+          <wp:extent cx="7772400" cy="806450"/>
           <wp:effectExtent l="0" t="0" r="0" b="0"/>
           <wp:wrapNone/>
-          <wp:docPr id="2" name="Imagen 2"/>
+          <wp:docPr id="1" name="Imagen 1"/>
           <wp:cNvGraphicFramePr>
             <a:graphicFrameLocks xmlns:a="http://schemas.openxmlformats.org/drawingml/2006/main" noChangeAspect="1"/>
           </wp:cNvGraphicFramePr>
@@ -1237,7 +1319,7 @@
             <a:graphicData uri="http://schemas.openxmlformats.org/drawingml/2006/picture">
               <pic:pic xmlns:pic="http://schemas.openxmlformats.org/drawingml/2006/picture">
                 <pic:nvPicPr>
-                  <pic:cNvPr id="0" name="Picture 3"/>
+                  <pic:cNvPr id="0" name="Picture 1"/>
                   <pic:cNvPicPr>
                     <a:picLocks noChangeAspect="1" noChangeArrowheads="1"/>
                   </pic:cNvPicPr>
@@ -1258,7 +1340,7 @@
                 <pic:spPr bwMode="auto">
                   <a:xfrm>
                     <a:off x="0" y="0"/>
-                    <a:ext cx="7546751" cy="955867"/>
+                    <a:ext cx="7772400" cy="806450"/>
                   </a:xfrm>
                   <a:prstGeom prst="rect">
                     <a:avLst/>
@@ -1274,9 +1356,6 @@
           <wp14:sizeRelH relativeFrom="margin">
             <wp14:pctWidth>0</wp14:pctWidth>
           </wp14:sizeRelH>
-          <wp14:sizeRelV relativeFrom="margin">
-            <wp14:pctHeight>0</wp14:pctHeight>
-          </wp14:sizeRelV>
         </wp:anchor>
       </w:drawing>
     </w:r>
@@ -1327,8 +1406,8 @@
       <w:tblLook w:val="0000" w:firstRow="0" w:lastRow="0" w:firstColumn="0" w:lastColumn="0" w:noHBand="0" w:noVBand="0"/>
     </w:tblPr>
     <w:tblGrid>
-      <w:gridCol w:w="6961"/>
-      <w:gridCol w:w="2100"/>
+      <w:gridCol w:w="7217"/>
+      <w:gridCol w:w="2178"/>
     </w:tblGrid>
     <w:tr>
       <w:trPr>
@@ -1357,18 +1436,18 @@
               <w:noProof/>
             </w:rPr>
             <w:drawing>
-              <wp:anchor distT="0" distB="0" distL="114300" distR="114300" simplePos="0" relativeHeight="251660288" behindDoc="1" locked="0" layoutInCell="1" allowOverlap="1" wp14:anchorId="68996C09" wp14:editId="3DE1A399">
+              <wp:anchor distT="0" distB="0" distL="114300" distR="114300" simplePos="0" relativeHeight="251663360" behindDoc="1" locked="0" layoutInCell="1" allowOverlap="1" wp14:anchorId="6E461A2A" wp14:editId="1266C0E9">
                 <wp:simplePos x="0" y="0"/>
                 <wp:positionH relativeFrom="column">
-                  <wp:posOffset>40640</wp:posOffset>
+                  <wp:posOffset>-6350</wp:posOffset>
                 </wp:positionH>
                 <wp:positionV relativeFrom="paragraph">
-                  <wp:posOffset>82550</wp:posOffset>
+                  <wp:posOffset>9525</wp:posOffset>
                 </wp:positionV>
-                <wp:extent cx="4312285" cy="831850"/>
-                <wp:effectExtent l="0" t="0" r="0" b="6350"/>
+                <wp:extent cx="4486910" cy="864870"/>
+                <wp:effectExtent l="0" t="0" r="0" b="0"/>
                 <wp:wrapNone/>
-                <wp:docPr id="10" name="Imagen 10"/>
+                <wp:docPr id="2" name="Imagen 2"/>
                 <wp:cNvGraphicFramePr>
                   <a:graphicFrameLocks xmlns:a="http://schemas.openxmlformats.org/drawingml/2006/main" noChangeAspect="1"/>
                 </wp:cNvGraphicFramePr>
@@ -1376,10 +1455,8 @@
                   <a:graphicData uri="http://schemas.openxmlformats.org/drawingml/2006/picture">
                     <pic:pic xmlns:pic="http://schemas.openxmlformats.org/drawingml/2006/picture">
                       <pic:nvPicPr>
-                        <pic:cNvPr id="0" name="Picture 3"/>
-                        <pic:cNvPicPr>
-                          <a:picLocks noChangeAspect="1" noChangeArrowheads="1"/>
-                        </pic:cNvPicPr>
+                        <pic:cNvPr id="1" name=""/>
+                        <pic:cNvPicPr/>
                       </pic:nvPicPr>
                       <pic:blipFill>
                         <a:blip r:embed="rId1">
@@ -1389,23 +1466,18 @@
                             </a:ext>
                           </a:extLst>
                         </a:blip>
-                        <a:srcRect/>
                         <a:stretch>
                           <a:fillRect/>
                         </a:stretch>
                       </pic:blipFill>
-                      <pic:spPr bwMode="auto">
+                      <pic:spPr>
                         <a:xfrm>
                           <a:off x="0" y="0"/>
-                          <a:ext cx="4312285" cy="831850"/>
+                          <a:ext cx="4486910" cy="864870"/>
                         </a:xfrm>
                         <a:prstGeom prst="rect">
                           <a:avLst/>
                         </a:prstGeom>
-                        <a:noFill/>
-                        <a:ln>
-                          <a:noFill/>
-                        </a:ln>
                       </pic:spPr>
                     </pic:pic>
                   </a:graphicData>

</xml_diff>